<commit_message>
Cap nhat thong tin TTCS_N1 mentor lich Sprint 1-4 va lien ket Jira da xac nhan
</commit_message>
<xml_diff>
--- a/theo-template/Danh_sach_can_bo_sung.docx
+++ b/theo-template/Danh_sach_can_bo_sung.docx
@@ -30,27 +30,83 @@
     </w:p>
     <w:p>
       <w:r>
-        <w:t>1. Thông tin bìa và lịch: tên nhóm, mentor, đơn vị, trường/ngành/lớp, kỳ thực tập, ngày báo cáo, ngày Sprint 0–4.</w:t>
+        <w:t>1. Jira: ảnh Backlog, Velocity, Burndown; SP cam kết/hoàn thành thực tế từng sprint. URL board đã có; chỉ cần export mới nếu cập nhật snapshot.</w:t>
       </w:r>
     </w:p>
     <w:p>
       <w:r>
-        <w:t>2. Jira: URL board, ảnh Backlog, Velocity, Burndown; SP cam kết/hoàn thành thực tế từng sprint. Export mới nếu muốn thay snapshot 18/10.</w:t>
+        <w:t>2. Git: ảnh Contributors/Commit graph; link + ảnh PR có trao đổi review; thống kê và account từng người. Kỳ từ 23/09 tới thời điểm báo cáo 21/10.</w:t>
       </w:r>
     </w:p>
     <w:p>
       <w:r>
-        <w:t>3. Git: ảnh Contributors/Commit graph; link + ảnh PR có trao đổi review; thống kê từng người và mapping account theo kỳ.</w:t>
+        <w:t>3. Sản phẩm/chất lượng: link deploy, video demo 2–3 phút; bug, coverage, hiệu năng và số người test nếu đã đo.</w:t>
       </w:r>
     </w:p>
     <w:p>
       <w:r>
-        <w:t>4. Sản phẩm/chất lượng: URL deploy, video 2–3 phút; số bug, coverage, hiệu năng và người test nếu đã đo.</w:t>
+        <w:t>4. Cá nhân: trước–sau, ticket/PR, xác nhận việc trực tiếp làm, tự đánh giá, nhận xét thật và định hướng nghề nghiệp cho cả 10 người.</w:t>
       </w:r>
     </w:p>
     <w:p>
       <w:r>
-        <w:t>5. Cá nhân/đóng góp: trước–sau, ticket/PR, tự đánh giá và nhận xét thật, nghề nghiệp; dữ liệu theo công thức 40/30/20/10 và xác nhận mentor.</w:t>
+        <w:t>5. Đóng góp: SP Done/PR/đánh giá chéo/điểm mentor theo công thức 40/30/20/10 và xác nhận tỷ lệ cuối; tên mentor đã có nhưng chưa có đánh giá.</w:t>
+      </w:r>
+    </w:p>
+    <w:p>
+      <w:pPr>
+        <w:pStyle w:val="Heading1"/>
+      </w:pPr>
+      <w:r>
+        <w:t>Đã được người dùng xác nhận</w:t>
+      </w:r>
+    </w:p>
+    <w:p>
+      <w:pPr>
+        <w:pStyle w:val="ListBullet"/>
+      </w:pPr>
+      <w:r>
+        <w:t>Nhóm TTCS_N1; mentor Triệu Quang Dũng; CodeGym.</w:t>
+      </w:r>
+    </w:p>
+    <w:p>
+      <w:pPr>
+        <w:pStyle w:val="ListBullet"/>
+      </w:pPr>
+      <w:r>
+        <w:t>Đại học CNTT &amp; Truyền thông Thái Nguyên / CNTT / CNTT K23G.</w:t>
+      </w:r>
+    </w:p>
+    <w:p>
+      <w:pPr>
+        <w:pStyle w:val="ListBullet"/>
+      </w:pPr>
+      <w:r>
+        <w:t>Thực tập 23/09–26/10/2026; báo cáo ngày 21/10/2026.</w:t>
+      </w:r>
+    </w:p>
+    <w:p>
+      <w:pPr>
+        <w:pStyle w:val="ListBullet"/>
+      </w:pPr>
+      <w:r>
+        <w:t>Sprint 1: 23–29/09; Sprint 2: 30/09–06/10; Sprint 3: 07–13/10; Sprint 4: 14–20/10. Mỗi sprint 7 ngày.</w:t>
+      </w:r>
+    </w:p>
+    <w:p>
+      <w:pPr>
+        <w:pStyle w:val="ListBullet"/>
+      </w:pPr>
+      <w:r>
+        <w:t>Phần B cho cả 10 thành viên; ba slide/người.</w:t>
+      </w:r>
+    </w:p>
+    <w:p>
+      <w:pPr>
+        <w:pStyle w:val="ListBullet"/>
+      </w:pPr>
+      <w:r>
+        <w:t>URL Jira: https://ictu-team-k8abz7ih.atlassian.net/jira/software/projects/N1/boards/3/backlog</w:t>
       </w:r>
     </w:p>
     <w:p>
@@ -146,7 +202,7 @@
         <w:pStyle w:val="ListBullet"/>
       </w:pPr>
       <w:r>
-        <w:t>Hiện trạng: Cần xác nhận</w:t>
+        <w:t>Hiện trạng: Đã cung cấp</w:t>
       </w:r>
     </w:p>
     <w:p>
@@ -162,7 +218,7 @@
         <w:pStyle w:val="ListBullet"/>
       </w:pPr>
       <w:r>
-        <w:t>Cần: Ngày bắt đầu/kết thúc thực tập; ngày báo cáo; lịch Sprint 0–4</w:t>
+        <w:t>Cần: Ngày bắt đầu/kết thúc thực tập; ngày báo cáo; lịch Sprint 1–4</w:t>
       </w:r>
     </w:p>
     <w:p>
@@ -178,7 +234,7 @@
         <w:pStyle w:val="ListBullet"/>
       </w:pPr>
       <w:r>
-        <w:t>Hiện trạng: Chưa có</w:t>
+        <w:t>Hiện trạng: Đã cung cấp</w:t>
       </w:r>
     </w:p>
     <w:p>
@@ -242,7 +298,7 @@
         <w:pStyle w:val="ListBullet"/>
       </w:pPr>
       <w:r>
-        <w:t>Hiện trạng: Chưa có</w:t>
+        <w:t>Hiện trạng: Đã có URL board; vẫn cần screenshot</w:t>
       </w:r>
     </w:p>
     <w:p>
@@ -274,7 +330,7 @@
         <w:pStyle w:val="ListBullet"/>
       </w:pPr>
       <w:r>
-        <w:t>Hiện trạng: Đã có bản 18/10; cần bản mới nếu cập nhật</w:t>
+        <w:t>Hiện trạng: Có URL và export 18/10; cần export mới nếu cập nhật</w:t>
       </w:r>
     </w:p>
     <w:p>
@@ -394,7 +450,7 @@
         <w:pStyle w:val="ListBullet"/>
       </w:pPr>
       <w:r>
-        <w:t>Cách lấy: Cần khoảng thời gian/nhánh/phạm vi. Loại node_modules, tệp sinh tự động, ZIP khi tính dòng code.</w:t>
+        <w:t>Cách lấy: Cần khoảng thời gian/nhánh/phạm vi. Loại node_modules, tệp sinh tự động, ZIP khi tính dòng code. Kỳ đã xác nhận: từ 23/09 đến thời điểm báo cáo 21/10/2026; không thống kê ngày sau đó.</w:t>
       </w:r>
     </w:p>
     <w:p>
@@ -618,7 +674,7 @@
         <w:pStyle w:val="ListBullet"/>
       </w:pPr>
       <w:r>
-        <w:t>Cách lấy: Tổng cả nhóm phải 100%. Mentor xác nhận đúng số liệu cuối.</w:t>
+        <w:t>Cách lấy: Tổng cả nhóm phải 100%. Mentor xác nhận đúng số liệu cuối. Mentor đã có tên Triệu Quang Dũng; chưa có xác nhận tỷ lệ.</w:t>
       </w:r>
     </w:p>
     <w:p>
@@ -770,7 +826,7 @@
         <w:pStyle w:val="ListBullet"/>
       </w:pPr>
       <w:r>
-        <w:t>Cần: Xác nhận làm Phần B cho 10 thành viên hay chỉ Triệu Quang Dũng</w:t>
+        <w:t>Cần: Phần B cho cả 10 thành viên</w:t>
       </w:r>
     </w:p>
     <w:p>
@@ -778,7 +834,7 @@
         <w:pStyle w:val="ListBullet"/>
       </w:pPr>
       <w:r>
-        <w:t>Cách lấy: Bản hiện tại chuẩn bị đủ khung cho 10 người, ba slide/người; có thể rút lại khi bạn xác nhận.</w:t>
+        <w:t>Cách lấy: Đã được người dùng xác nhận, giữ ba slide/người theo template.</w:t>
       </w:r>
     </w:p>
     <w:p>
@@ -786,7 +842,7 @@
         <w:pStyle w:val="ListBullet"/>
       </w:pPr>
       <w:r>
-        <w:t>Hiện trạng: Đang chờ trả lời</w:t>
+        <w:t>Hiện trạng: Đã xác nhận</w:t>
       </w:r>
     </w:p>
     <w:p>

</xml_diff>